<commit_message>
Enrich master with evidenced keywords; expand title
- Skills: add Spring Framework, JPA, Maven; label SQL/NoSQL and DevOps & CI/CD;
  new Practices line (Microservices, Design Patterns, Clean Coding, Agile/Scrum)
- Experience heading: SDE-1 -> Software Development Engineer (SDE-1)
- Verb variety: Built -> Designed (LLM), Built -> Established (BA); surface stakeholders

Co-Authored-By: Claude Opus 4.8 (1M context) <noreply@anthropic.com>
</commit_message>
<xml_diff>
--- a/Simran_Tanwani_Resume.docx
+++ b/Simran_Tanwani_Resume.docx
@@ -153,7 +153,7 @@
         <w:t xml:space="preserve"> </w:t>
       </w:r>
       <w:r>
-        <w:t xml:space="preserve">Spring Boot, Go Fiber, Node.js, Vercel AI SDK</w:t>
+        <w:t xml:space="preserve">Spring Boot, Spring Framework, JPA, Go Fiber, Node.js, Vercel AI SDK</w:t>
       </w:r>
     </w:p>
     <w:p>
@@ -175,7 +175,7 @@
         <w:t xml:space="preserve"> </w:t>
       </w:r>
       <w:r>
-        <w:t xml:space="preserve">PostgreSQL (pgx, sqlc), Redis, Dragonfly</w:t>
+        <w:t xml:space="preserve">PostgreSQL (SQL), Redis &amp; Dragonfly (NoSQL), pgx, sqlc</w:t>
       </w:r>
     </w:p>
     <w:p>
@@ -191,13 +191,13 @@
           <w:b/>
           <w:bCs/>
         </w:rPr>
-        <w:t xml:space="preserve">DevOps:</w:t>
-      </w:r>
-      <w:r>
-        <w:t xml:space="preserve"> </w:t>
-      </w:r>
-      <w:r>
-        <w:t xml:space="preserve">Kubernetes (K3s), ArgoCD, Docker, Git, Google Cloud Tasks, OpenTelemetry</w:t>
+        <w:t xml:space="preserve">DevOps &amp; CI/CD:</w:t>
+      </w:r>
+      <w:r>
+        <w:t xml:space="preserve"> </w:t>
+      </w:r>
+      <w:r>
+        <w:t xml:space="preserve">Kubernetes (K3s), ArgoCD, Docker, Git, Maven, Google Cloud Tasks, OpenTelemetry</w:t>
       </w:r>
     </w:p>
     <w:p>
@@ -223,6 +223,28 @@
       </w:r>
     </w:p>
     <w:p>
+      <w:pPr>
+        <w:pStyle w:val="Compact"/>
+        <w:numPr>
+          <w:ilvl w:val="0"/>
+          <w:numId w:val="1001"/>
+        </w:numPr>
+      </w:pPr>
+      <w:r>
+        <w:rPr>
+          <w:b/>
+          <w:bCs/>
+        </w:rPr>
+        <w:t xml:space="preserve">Practices:</w:t>
+      </w:r>
+      <w:r>
+        <w:t xml:space="preserve"> </w:t>
+      </w:r>
+      <w:r>
+        <w:t xml:space="preserve">Microservices, Design Patterns, Clean Coding, Agile/Scrum</w:t>
+      </w:r>
+    </w:p>
+    <w:p>
       <w:r>
         <w:pict>
           <v:rect style="width:0;height:1.5pt" o:hralign="center" o:hrstd="t" o:hr="t"/>
@@ -239,13 +261,13 @@
         <w:t xml:space="preserve">Experience</w:t>
       </w:r>
     </w:p>
-    <w:bookmarkStart w:id="14" w:name="sde-1-healofy-may-2025-present"/>
+    <w:bookmarkStart w:id="14" w:name="Xd2a2a421207e916512b82553aefab4dcd2061c0"/>
     <w:p>
       <w:pPr>
         <w:pStyle w:val="Heading3"/>
       </w:pPr>
       <w:r>
-        <w:t xml:space="preserve">SDE-1 |</w:t>
+        <w:t xml:space="preserve">Software Development Engineer (SDE-1) |</w:t>
       </w:r>
       <w:r>
         <w:t xml:space="preserve"> </w:t>
@@ -358,7 +380,7 @@
         </w:numPr>
       </w:pPr>
       <w:r>
-        <w:t xml:space="preserve">Built a multi-provider LLM orchestration service (TypeScript/Node.js, Vercel AI SDK) integrating</w:t>
+        <w:t xml:space="preserve">Designed a multi-provider LLM orchestration service (TypeScript/Node.js, Vercel AI SDK) integrating</w:t>
       </w:r>
       <w:r>
         <w:t xml:space="preserve"> </w:t>
@@ -501,7 +523,7 @@
         </w:numPr>
       </w:pPr>
       <w:r>
-        <w:t xml:space="preserve">Built</w:t>
+        <w:t xml:space="preserve">Established</w:t>
       </w:r>
       <w:r>
         <w:t xml:space="preserve"> </w:t>
@@ -517,7 +539,7 @@
         <w:t xml:space="preserve"> </w:t>
       </w:r>
       <w:r>
-        <w:t xml:space="preserve">reporting standards across Product, Finance &amp; Growth teams</w:t>
+        <w:t xml:space="preserve">reporting standards for stakeholders across Product, Finance &amp; Growth</w:t>
       </w:r>
     </w:p>
     <w:p>

</xml_diff>

<commit_message>
Add TDD/BDD (confirmed practiced) and stakeholder communication
- Practices: add TDD/BDD
- BA bullet: surface 'stakeholder communication' (Communication soft skill)

Co-Authored-By: Claude Opus 4.8 (1M context) <noreply@anthropic.com>
</commit_message>
<xml_diff>
--- a/Simran_Tanwani_Resume.docx
+++ b/Simran_Tanwani_Resume.docx
@@ -241,7 +241,7 @@
         <w:t xml:space="preserve"> </w:t>
       </w:r>
       <w:r>
-        <w:t xml:space="preserve">Microservices, Design Patterns, Clean Coding, Agile/Scrum</w:t>
+        <w:t xml:space="preserve">Microservices, Design Patterns, Clean Coding, TDD/BDD, Agile/Scrum</w:t>
       </w:r>
     </w:p>
     <w:p>
@@ -539,7 +539,7 @@
         <w:t xml:space="preserve"> </w:t>
       </w:r>
       <w:r>
-        <w:t xml:space="preserve">reporting standards for stakeholders across Product, Finance &amp; Growth</w:t>
+        <w:t xml:space="preserve">reporting standards with clear stakeholder communication across Product, Finance &amp; Growth</w:t>
       </w:r>
     </w:p>
     <w:p>

</xml_diff>